<commit_message>
correccion cartera en produccion con pagofactura
</commit_message>
<xml_diff>
--- a/Notas paraFacturas.docx
+++ b/Notas paraFacturas.docx
@@ -37,7 +37,7 @@
         <w:rPr>
           <w:lang w:val="es-ES"/>
         </w:rPr>
-        <w:t xml:space="preserve">Enviar por email facturación </w:t>
+        <w:t xml:space="preserve">Corregir cartera en producción  </w:t>
       </w:r>
     </w:p>
     <w:p>
@@ -55,7 +55,13 @@
         <w:rPr>
           <w:lang w:val="es-ES"/>
         </w:rPr>
-        <w:t>Proteger rutas</w:t>
+        <w:t xml:space="preserve">Corregir suspensión en vez de </w:t>
+      </w:r>
+      <w:r>
+        <w:rPr>
+          <w:lang w:val="es-ES"/>
+        </w:rPr>
+        <w:t>suspensión</w:t>
       </w:r>
     </w:p>
     <w:p>
@@ -73,7 +79,19 @@
         <w:rPr>
           <w:lang w:val="es-ES"/>
         </w:rPr>
-        <w:t>Modificar estado en formulario suscripción, incluir otros estados, solo esta activo e inactivo, falta suspendida, entre otros; tampoco está guardando cambios.</w:t>
+        <w:t xml:space="preserve">Corregir 404 en </w:t>
+      </w:r>
+      <w:r>
+        <w:rPr>
+          <w:lang w:val="es-ES"/>
+        </w:rPr>
+        <w:t>producción</w:t>
+      </w:r>
+      <w:r>
+        <w:rPr>
+          <w:lang w:val="es-ES"/>
+        </w:rPr>
+        <w:t xml:space="preserve"> cuando recarga la pagina </w:t>
       </w:r>
     </w:p>
     <w:p>
@@ -91,6 +109,42 @@
         <w:rPr>
           <w:lang w:val="es-ES"/>
         </w:rPr>
+        <w:t xml:space="preserve">Enviar por email facturación </w:t>
+      </w:r>
+    </w:p>
+    <w:p>
+      <w:pPr>
+        <w:pStyle w:val="Prrafodelista"/>
+        <w:numPr>
+          <w:ilvl w:val="0"/>
+          <w:numId w:val="3"/>
+        </w:numPr>
+        <w:rPr>
+          <w:lang w:val="es-ES"/>
+        </w:rPr>
+      </w:pPr>
+      <w:r>
+        <w:rPr>
+          <w:lang w:val="es-ES"/>
+        </w:rPr>
+        <w:t>Proteger rutas</w:t>
+      </w:r>
+    </w:p>
+    <w:p>
+      <w:pPr>
+        <w:pStyle w:val="Prrafodelista"/>
+        <w:numPr>
+          <w:ilvl w:val="0"/>
+          <w:numId w:val="3"/>
+        </w:numPr>
+        <w:rPr>
+          <w:lang w:val="es-ES"/>
+        </w:rPr>
+      </w:pPr>
+      <w:r>
+        <w:rPr>
+          <w:lang w:val="es-ES"/>
+        </w:rPr>
         <w:t>En migración:</w:t>
       </w:r>
     </w:p>
@@ -129,6 +183,15 @@
         </w:rPr>
         <w:t>Traer saldo pendiente por pagar</w:t>
       </w:r>
+    </w:p>
+    <w:p>
+      <w:pPr>
+        <w:pStyle w:val="Prrafodelista"/>
+        <w:ind w:left="1440"/>
+        <w:rPr>
+          <w:lang w:val="es-ES"/>
+        </w:rPr>
+      </w:pPr>
       <w:r>
         <w:rPr>
           <w:lang w:val="es-ES"/>
@@ -171,6 +234,36 @@
           <w:lang w:val="es-ES"/>
         </w:rPr>
         <w:t>Cambiar estado Retirado a Retiro</w:t>
+      </w:r>
+      <w:r>
+        <w:rPr>
+          <w:lang w:val="es-ES"/>
+        </w:rPr>
+        <w:t xml:space="preserve"> </w:t>
+      </w:r>
+      <w:r>
+        <w:rPr>
+          <w:lang w:val="es-ES"/>
+        </w:rPr>
+        <w:sym w:font="Wingdings 2" w:char="F050"/>
+      </w:r>
+    </w:p>
+    <w:p>
+      <w:pPr>
+        <w:pStyle w:val="Prrafodelista"/>
+        <w:numPr>
+          <w:ilvl w:val="0"/>
+          <w:numId w:val="3"/>
+        </w:numPr>
+        <w:rPr>
+          <w:lang w:val="es-ES"/>
+        </w:rPr>
+      </w:pPr>
+      <w:r>
+        <w:rPr>
+          <w:lang w:val="es-ES"/>
+        </w:rPr>
+        <w:t>Subir a producción</w:t>
       </w:r>
     </w:p>
     <w:p>
@@ -358,8 +451,16 @@
         <w:rPr>
           <w:lang w:val="es-ES"/>
         </w:rPr>
-        <w:t>Ajuste en Pagos.idPago</w:t>
-      </w:r>
+        <w:t xml:space="preserve">Ajuste en </w:t>
+      </w:r>
+      <w:proofErr w:type="spellStart"/>
+      <w:r>
+        <w:rPr>
+          <w:lang w:val="es-ES"/>
+        </w:rPr>
+        <w:t>Pagos.idPago</w:t>
+      </w:r>
+      <w:proofErr w:type="spellEnd"/>
       <w:r>
         <w:rPr>
           <w:lang w:val="es-ES"/>
@@ -450,6 +551,230 @@
           <w:lang w:val="es-ES"/>
         </w:rPr>
       </w:pPr>
+    </w:p>
+    <w:p>
+      <w:pPr>
+        <w:pBdr>
+          <w:bottom w:val="single" w:sz="6" w:space="1" w:color="auto"/>
+        </w:pBdr>
+        <w:rPr>
+          <w:lang w:val="es-ES"/>
+        </w:rPr>
+      </w:pPr>
+    </w:p>
+    <w:p>
+      <w:pPr>
+        <w:rPr>
+          <w:lang w:val="es-ES"/>
+        </w:rPr>
+      </w:pPr>
+      <w:r>
+        <w:rPr>
+          <w:lang w:val="es-ES"/>
+        </w:rPr>
+        <w:t xml:space="preserve">Tengo </w:t>
+      </w:r>
+      <w:proofErr w:type="spellStart"/>
+      <w:r>
+        <w:rPr>
+          <w:lang w:val="es-ES"/>
+        </w:rPr>
+        <w:t>parafacturas</w:t>
+      </w:r>
+      <w:proofErr w:type="spellEnd"/>
+      <w:r>
+        <w:rPr>
+          <w:lang w:val="es-ES"/>
+        </w:rPr>
+        <w:t xml:space="preserve"> en </w:t>
+      </w:r>
+      <w:proofErr w:type="spellStart"/>
+      <w:r>
+        <w:rPr>
+          <w:lang w:val="es-ES"/>
+        </w:rPr>
+        <w:t>produccion</w:t>
+      </w:r>
+      <w:proofErr w:type="spellEnd"/>
+      <w:r>
+        <w:rPr>
+          <w:lang w:val="es-ES"/>
+        </w:rPr>
+        <w:t xml:space="preserve">, esta pasando que cuando se intenta recargar la pagina sale error que te muestro en la imagen, solo sale en </w:t>
+      </w:r>
+      <w:proofErr w:type="spellStart"/>
+      <w:r>
+        <w:rPr>
+          <w:lang w:val="es-ES"/>
+        </w:rPr>
+        <w:t>produccion</w:t>
+      </w:r>
+      <w:proofErr w:type="spellEnd"/>
+      <w:r>
+        <w:rPr>
+          <w:lang w:val="es-ES"/>
+        </w:rPr>
+        <w:t xml:space="preserve">, porque en desarrollo funciona bien, en desarrollo la pagina carga sin problema, solo es en </w:t>
+      </w:r>
+      <w:proofErr w:type="spellStart"/>
+      <w:r>
+        <w:rPr>
+          <w:lang w:val="es-ES"/>
+        </w:rPr>
+        <w:t>produccion</w:t>
+      </w:r>
+      <w:proofErr w:type="spellEnd"/>
+      <w:r>
+        <w:rPr>
+          <w:lang w:val="es-ES"/>
+        </w:rPr>
+        <w:t>,</w:t>
+      </w:r>
+      <w:r>
+        <w:rPr>
+          <w:lang w:val="es-ES"/>
+        </w:rPr>
+        <w:br/>
+      </w:r>
+      <w:r>
+        <w:rPr>
+          <w:lang w:val="es-ES"/>
+        </w:rPr>
+        <w:br/>
+        <w:t xml:space="preserve">el </w:t>
+      </w:r>
+      <w:proofErr w:type="spellStart"/>
+      <w:r>
+        <w:rPr>
+          <w:lang w:val="es-ES"/>
+        </w:rPr>
+        <w:t>backend</w:t>
+      </w:r>
+      <w:proofErr w:type="spellEnd"/>
+      <w:r>
+        <w:rPr>
+          <w:lang w:val="es-ES"/>
+        </w:rPr>
+        <w:t xml:space="preserve"> esta en </w:t>
+      </w:r>
+      <w:proofErr w:type="spellStart"/>
+      <w:r>
+        <w:rPr>
+          <w:lang w:val="es-ES"/>
+        </w:rPr>
+        <w:t>railway</w:t>
+      </w:r>
+      <w:proofErr w:type="spellEnd"/>
+      <w:r>
+        <w:rPr>
+          <w:lang w:val="es-ES"/>
+        </w:rPr>
+        <w:t xml:space="preserve"> y el </w:t>
+      </w:r>
+      <w:proofErr w:type="spellStart"/>
+      <w:r>
+        <w:rPr>
+          <w:lang w:val="es-ES"/>
+        </w:rPr>
+        <w:t>frontend</w:t>
+      </w:r>
+      <w:proofErr w:type="spellEnd"/>
+      <w:r>
+        <w:rPr>
+          <w:lang w:val="es-ES"/>
+        </w:rPr>
+        <w:t xml:space="preserve"> </w:t>
+      </w:r>
+      <w:proofErr w:type="spellStart"/>
+      <w:r>
+        <w:rPr>
+          <w:lang w:val="es-ES"/>
+        </w:rPr>
+        <w:t>esta</w:t>
+      </w:r>
+      <w:proofErr w:type="spellEnd"/>
+      <w:r>
+        <w:rPr>
+          <w:lang w:val="es-ES"/>
+        </w:rPr>
+        <w:t xml:space="preserve"> en </w:t>
+      </w:r>
+      <w:proofErr w:type="spellStart"/>
+      <w:r>
+        <w:rPr>
+          <w:lang w:val="es-ES"/>
+        </w:rPr>
+        <w:t>vercel</w:t>
+      </w:r>
+      <w:proofErr w:type="spellEnd"/>
+    </w:p>
+    <w:p>
+      <w:pPr>
+        <w:rPr>
+          <w:lang w:val="es-ES"/>
+        </w:rPr>
+      </w:pPr>
+    </w:p>
+    <w:p>
+      <w:pPr>
+        <w:rPr>
+          <w:lang w:val="es-ES"/>
+        </w:rPr>
+      </w:pPr>
+      <w:r>
+        <w:rPr>
+          <w:lang w:val="es-ES"/>
+        </w:rPr>
+        <w:t>Escríbeme posibles causas</w:t>
+      </w:r>
+    </w:p>
+    <w:p>
+      <w:pPr>
+        <w:rPr>
+          <w:lang w:val="es-ES"/>
+        </w:rPr>
+      </w:pPr>
+      <w:r>
+        <w:rPr>
+          <w:noProof/>
+        </w:rPr>
+        <w:lastRenderedPageBreak/>
+        <w:drawing>
+          <wp:inline distT="0" distB="0" distL="0" distR="0" wp14:anchorId="66C54B94" wp14:editId="3D0A70B9">
+            <wp:extent cx="5400040" cy="2693035"/>
+            <wp:effectExtent l="0" t="0" r="0" b="0"/>
+            <wp:docPr id="1" name="Imagen 1"/>
+            <wp:cNvGraphicFramePr>
+              <a:graphicFrameLocks xmlns:a="http://schemas.openxmlformats.org/drawingml/2006/main" noChangeAspect="1"/>
+            </wp:cNvGraphicFramePr>
+            <a:graphic xmlns:a="http://schemas.openxmlformats.org/drawingml/2006/main">
+              <a:graphicData uri="http://schemas.openxmlformats.org/drawingml/2006/picture">
+                <pic:pic xmlns:pic="http://schemas.openxmlformats.org/drawingml/2006/picture">
+                  <pic:nvPicPr>
+                    <pic:cNvPr id="1" name=""/>
+                    <pic:cNvPicPr/>
+                  </pic:nvPicPr>
+                  <pic:blipFill>
+                    <a:blip r:embed="rId5"/>
+                    <a:stretch>
+                      <a:fillRect/>
+                    </a:stretch>
+                  </pic:blipFill>
+                  <pic:spPr>
+                    <a:xfrm>
+                      <a:off x="0" y="0"/>
+                      <a:ext cx="5400040" cy="2693035"/>
+                    </a:xfrm>
+                    <a:prstGeom prst="rect">
+                      <a:avLst/>
+                    </a:prstGeom>
+                  </pic:spPr>
+                </pic:pic>
+              </a:graphicData>
+            </a:graphic>
+          </wp:inline>
+        </w:drawing>
+      </w:r>
     </w:p>
     <w:sectPr>
       <w:pgSz w:w="11906" w:h="16838"/>

</xml_diff>

<commit_message>
Cooreccion cartera en produccion
</commit_message>
<xml_diff>
--- a/Notas paraFacturas.docx
+++ b/Notas paraFacturas.docx
@@ -37,7 +37,13 @@
         <w:rPr>
           <w:lang w:val="es-ES"/>
         </w:rPr>
-        <w:t xml:space="preserve">Corregir cartera en producción  </w:t>
+        <w:t xml:space="preserve">Corregir suspensión en vez de </w:t>
+      </w:r>
+      <w:r>
+        <w:rPr>
+          <w:lang w:val="es-ES"/>
+        </w:rPr>
+        <w:t>suspensión</w:t>
       </w:r>
     </w:p>
     <w:p>
@@ -55,13 +61,7 @@
         <w:rPr>
           <w:lang w:val="es-ES"/>
         </w:rPr>
-        <w:t xml:space="preserve">Corregir suspensión en vez de </w:t>
-      </w:r>
-      <w:r>
-        <w:rPr>
-          <w:lang w:val="es-ES"/>
-        </w:rPr>
-        <w:t>suspensión</w:t>
+        <w:t>Formularios de impresión</w:t>
       </w:r>
     </w:p>
     <w:p>
@@ -79,19 +79,7 @@
         <w:rPr>
           <w:lang w:val="es-ES"/>
         </w:rPr>
-        <w:t xml:space="preserve">Corregir 404 en </w:t>
-      </w:r>
-      <w:r>
-        <w:rPr>
-          <w:lang w:val="es-ES"/>
-        </w:rPr>
-        <w:t>producción</w:t>
-      </w:r>
-      <w:r>
-        <w:rPr>
-          <w:lang w:val="es-ES"/>
-        </w:rPr>
-        <w:t xml:space="preserve"> cuando recarga la pagina </w:t>
+        <w:t xml:space="preserve">Enviar por email facturación </w:t>
       </w:r>
     </w:p>
     <w:p>
@@ -109,7 +97,7 @@
         <w:rPr>
           <w:lang w:val="es-ES"/>
         </w:rPr>
-        <w:t xml:space="preserve">Enviar por email facturación </w:t>
+        <w:t>Proteger rutas</w:t>
       </w:r>
     </w:p>
     <w:p>
@@ -127,7 +115,71 @@
         <w:rPr>
           <w:lang w:val="es-ES"/>
         </w:rPr>
-        <w:t>Proteger rutas</w:t>
+        <w:t>En migración:</w:t>
+      </w:r>
+    </w:p>
+    <w:p>
+      <w:pPr>
+        <w:pStyle w:val="Prrafodelista"/>
+        <w:numPr>
+          <w:ilvl w:val="1"/>
+          <w:numId w:val="3"/>
+        </w:numPr>
+        <w:rPr>
+          <w:lang w:val="es-ES"/>
+        </w:rPr>
+      </w:pPr>
+      <w:r>
+        <w:rPr>
+          <w:lang w:val="es-ES"/>
+        </w:rPr>
+        <w:t>Crear novedad con desconectados</w:t>
+      </w:r>
+    </w:p>
+    <w:p>
+      <w:pPr>
+        <w:pStyle w:val="Prrafodelista"/>
+        <w:numPr>
+          <w:ilvl w:val="1"/>
+          <w:numId w:val="3"/>
+        </w:numPr>
+        <w:rPr>
+          <w:lang w:val="es-ES"/>
+        </w:rPr>
+      </w:pPr>
+      <w:r>
+        <w:rPr>
+          <w:lang w:val="es-ES"/>
+        </w:rPr>
+        <w:t>Traer saldo pendiente por pagar</w:t>
+      </w:r>
+    </w:p>
+    <w:p>
+      <w:pPr>
+        <w:pStyle w:val="Prrafodelista"/>
+        <w:ind w:left="1440"/>
+        <w:rPr>
+          <w:lang w:val="es-ES"/>
+        </w:rPr>
+      </w:pPr>
+      <w:r>
+        <w:rPr>
+          <w:lang w:val="es-ES"/>
+        </w:rPr>
+        <w:br/>
+      </w:r>
+    </w:p>
+    <w:p>
+      <w:pPr>
+        <w:rPr>
+          <w:lang w:val="es-ES"/>
+        </w:rPr>
+      </w:pPr>
+      <w:r>
+        <w:rPr>
+          <w:lang w:val="es-ES"/>
+        </w:rPr>
+        <w:t>2/12</w:t>
       </w:r>
     </w:p>
     <w:p>
@@ -145,77 +197,19 @@
         <w:rPr>
           <w:lang w:val="es-ES"/>
         </w:rPr>
-        <w:t>En migración:</w:t>
-      </w:r>
-    </w:p>
-    <w:p>
-      <w:pPr>
-        <w:pStyle w:val="Prrafodelista"/>
-        <w:numPr>
-          <w:ilvl w:val="1"/>
-          <w:numId w:val="3"/>
-        </w:numPr>
-        <w:rPr>
-          <w:lang w:val="es-ES"/>
-        </w:rPr>
-      </w:pPr>
-      <w:r>
-        <w:rPr>
-          <w:lang w:val="es-ES"/>
-        </w:rPr>
-        <w:t>Crear novedad con desconectados</w:t>
-      </w:r>
-    </w:p>
-    <w:p>
-      <w:pPr>
-        <w:pStyle w:val="Prrafodelista"/>
-        <w:numPr>
-          <w:ilvl w:val="1"/>
-          <w:numId w:val="3"/>
-        </w:numPr>
-        <w:rPr>
-          <w:lang w:val="es-ES"/>
-        </w:rPr>
-      </w:pPr>
-      <w:r>
-        <w:rPr>
-          <w:lang w:val="es-ES"/>
-        </w:rPr>
-        <w:t>Traer saldo pendiente por pagar</w:t>
-      </w:r>
-    </w:p>
-    <w:p>
-      <w:pPr>
-        <w:pStyle w:val="Prrafodelista"/>
-        <w:ind w:left="1440"/>
-        <w:rPr>
-          <w:lang w:val="es-ES"/>
-        </w:rPr>
-      </w:pPr>
-      <w:r>
-        <w:rPr>
-          <w:lang w:val="es-ES"/>
-        </w:rPr>
-        <w:br/>
-      </w:r>
-    </w:p>
-    <w:p>
-      <w:pPr>
-        <w:rPr>
-          <w:lang w:val="es-ES"/>
-        </w:rPr>
-      </w:pPr>
-      <w:r>
-        <w:rPr>
-          <w:lang w:val="es-ES"/>
-        </w:rPr>
-        <w:t>16</w:t>
-      </w:r>
-      <w:r>
-        <w:rPr>
-          <w:lang w:val="es-ES"/>
-        </w:rPr>
-        <w:t>/11/2025</w:t>
+        <w:t>Corregir 404 en producción cuando carga</w:t>
+      </w:r>
+      <w:r>
+        <w:rPr>
+          <w:lang w:val="es-ES"/>
+        </w:rPr>
+        <w:t xml:space="preserve"> </w:t>
+      </w:r>
+      <w:r>
+        <w:rPr>
+          <w:lang w:val="es-ES"/>
+        </w:rPr>
+        <w:sym w:font="Wingdings 2" w:char="F050"/>
       </w:r>
     </w:p>
     <w:p>
@@ -233,13 +227,13 @@
         <w:rPr>
           <w:lang w:val="es-ES"/>
         </w:rPr>
-        <w:t>Cambiar estado Retirado a Retiro</w:t>
-      </w:r>
-      <w:r>
-        <w:rPr>
-          <w:lang w:val="es-ES"/>
-        </w:rPr>
-        <w:t xml:space="preserve"> </w:t>
+        <w:t xml:space="preserve">Corregir </w:t>
+      </w:r>
+      <w:r>
+        <w:rPr>
+          <w:lang w:val="es-ES"/>
+        </w:rPr>
+        <w:t xml:space="preserve">cartera en producción  </w:t>
       </w:r>
       <w:r>
         <w:rPr>
@@ -263,7 +257,112 @@
         <w:rPr>
           <w:lang w:val="es-ES"/>
         </w:rPr>
+        <w:t xml:space="preserve">Corregir estado </w:t>
+      </w:r>
+      <w:proofErr w:type="spellStart"/>
+      <w:r>
+        <w:rPr>
+          <w:lang w:val="es-ES"/>
+        </w:rPr>
+        <w:t>a</w:t>
+      </w:r>
+      <w:proofErr w:type="spellEnd"/>
+      <w:r>
+        <w:rPr>
+          <w:lang w:val="es-ES"/>
+        </w:rPr>
+        <w:t xml:space="preserve"> suspendido</w:t>
+      </w:r>
+    </w:p>
+    <w:p>
+      <w:pPr>
+        <w:pStyle w:val="Prrafodelista"/>
+        <w:numPr>
+          <w:ilvl w:val="0"/>
+          <w:numId w:val="3"/>
+        </w:numPr>
+        <w:rPr>
+          <w:lang w:val="es-ES"/>
+        </w:rPr>
+      </w:pPr>
+    </w:p>
+    <w:p>
+      <w:pPr>
+        <w:rPr>
+          <w:lang w:val="es-ES"/>
+        </w:rPr>
+      </w:pPr>
+      <w:r>
+        <w:rPr>
+          <w:lang w:val="es-ES"/>
+        </w:rPr>
+        <w:t>16</w:t>
+      </w:r>
+      <w:r>
+        <w:rPr>
+          <w:lang w:val="es-ES"/>
+        </w:rPr>
+        <w:t>/11/2025</w:t>
+      </w:r>
+    </w:p>
+    <w:p>
+      <w:pPr>
+        <w:pStyle w:val="Prrafodelista"/>
+        <w:numPr>
+          <w:ilvl w:val="0"/>
+          <w:numId w:val="3"/>
+        </w:numPr>
+        <w:rPr>
+          <w:lang w:val="es-ES"/>
+        </w:rPr>
+      </w:pPr>
+      <w:r>
+        <w:rPr>
+          <w:lang w:val="es-ES"/>
+        </w:rPr>
+        <w:t>Cambiar estado Retirado a Retiro</w:t>
+      </w:r>
+      <w:r>
+        <w:rPr>
+          <w:lang w:val="es-ES"/>
+        </w:rPr>
+        <w:t xml:space="preserve"> </w:t>
+      </w:r>
+      <w:r>
+        <w:rPr>
+          <w:lang w:val="es-ES"/>
+        </w:rPr>
+        <w:sym w:font="Wingdings 2" w:char="F050"/>
+      </w:r>
+    </w:p>
+    <w:p>
+      <w:pPr>
+        <w:pStyle w:val="Prrafodelista"/>
+        <w:numPr>
+          <w:ilvl w:val="0"/>
+          <w:numId w:val="3"/>
+        </w:numPr>
+        <w:rPr>
+          <w:lang w:val="es-ES"/>
+        </w:rPr>
+      </w:pPr>
+      <w:r>
+        <w:rPr>
+          <w:lang w:val="es-ES"/>
+        </w:rPr>
         <w:t>Subir a producción</w:t>
+      </w:r>
+      <w:r>
+        <w:rPr>
+          <w:lang w:val="es-ES"/>
+        </w:rPr>
+        <w:t xml:space="preserve"> </w:t>
+      </w:r>
+      <w:r>
+        <w:rPr>
+          <w:lang w:val="es-ES"/>
+        </w:rPr>
+        <w:sym w:font="Wingdings 2" w:char="F050"/>
       </w:r>
     </w:p>
     <w:p>
@@ -600,7 +699,21 @@
         <w:rPr>
           <w:lang w:val="es-ES"/>
         </w:rPr>
-        <w:t xml:space="preserve">, esta pasando que cuando se intenta recargar la pagina sale error que te muestro en la imagen, solo sale en </w:t>
+        <w:t xml:space="preserve">, </w:t>
+      </w:r>
+      <w:proofErr w:type="spellStart"/>
+      <w:r>
+        <w:rPr>
+          <w:lang w:val="es-ES"/>
+        </w:rPr>
+        <w:t>esta</w:t>
+      </w:r>
+      <w:proofErr w:type="spellEnd"/>
+      <w:r>
+        <w:rPr>
+          <w:lang w:val="es-ES"/>
+        </w:rPr>
+        <w:t xml:space="preserve"> pasando que cuando se intenta recargar la pagina sale error que te muestro en la imagen, solo sale en </w:t>
       </w:r>
       <w:proofErr w:type="spellStart"/>
       <w:r>
@@ -655,7 +768,21 @@
         <w:rPr>
           <w:lang w:val="es-ES"/>
         </w:rPr>
-        <w:t xml:space="preserve"> esta en </w:t>
+        <w:t xml:space="preserve"> </w:t>
+      </w:r>
+      <w:proofErr w:type="spellStart"/>
+      <w:r>
+        <w:rPr>
+          <w:lang w:val="es-ES"/>
+        </w:rPr>
+        <w:t>esta</w:t>
+      </w:r>
+      <w:proofErr w:type="spellEnd"/>
+      <w:r>
+        <w:rPr>
+          <w:lang w:val="es-ES"/>
+        </w:rPr>
+        <w:t xml:space="preserve"> en </w:t>
       </w:r>
       <w:proofErr w:type="spellStart"/>
       <w:r>
@@ -1690,6 +1817,16 @@
       <w:contextualSpacing/>
     </w:pPr>
   </w:style>
+  <w:style w:type="character" w:styleId="Textodelmarcadordeposicin">
+    <w:name w:val="Placeholder Text"/>
+    <w:basedOn w:val="Fuentedeprrafopredeter"/>
+    <w:uiPriority w:val="99"/>
+    <w:semiHidden/>
+    <w:rsid w:val="008163F6"/>
+    <w:rPr>
+      <w:color w:val="808080"/>
+    </w:rPr>
+  </w:style>
 </w:styles>
 </file>
 

</xml_diff>